<commit_message>
fila, celda y operaciones
</commit_message>
<xml_diff>
--- a/documentacion.docx
+++ b/documentacion.docx
@@ -6756,10 +6756,7 @@
         </w:numPr>
       </w:pPr>
       <w:r>
-        <w:t>A</w:t>
-      </w:r>
-      <w:r>
-        <w:t>ngular</w:t>
+        <w:t>Angular</w:t>
       </w:r>
     </w:p>
     <w:p>
@@ -6781,10 +6778,7 @@
         </w:numPr>
       </w:pPr>
       <w:r>
-        <w:t>V</w:t>
-      </w:r>
-      <w:r>
-        <w:t>isual</w:t>
+        <w:t>Visual</w:t>
       </w:r>
       <w:r>
         <w:t xml:space="preserve"> </w:t>
@@ -6939,6 +6933,72 @@
     </w:p>
     <w:p>
       <w:pPr>
+        <w:keepNext/>
+        <w:jc w:val="center"/>
+      </w:pPr>
+      <w:r>
+        <w:rPr>
+          <w:noProof/>
+        </w:rPr>
+        <w:drawing>
+          <wp:inline distT="0" distB="0" distL="0" distR="0" wp14:anchorId="79A8710B" wp14:editId="05562794">
+            <wp:extent cx="5400040" cy="2154555"/>
+            <wp:effectExtent l="0" t="0" r="0" b="0"/>
+            <wp:docPr id="727323402" name="Imagen 1"/>
+            <wp:cNvGraphicFramePr>
+              <a:graphicFrameLocks xmlns:a="http://schemas.openxmlformats.org/drawingml/2006/main" noChangeAspect="1"/>
+            </wp:cNvGraphicFramePr>
+            <a:graphic xmlns:a="http://schemas.openxmlformats.org/drawingml/2006/main">
+              <a:graphicData uri="http://schemas.openxmlformats.org/drawingml/2006/picture">
+                <pic:pic xmlns:pic="http://schemas.openxmlformats.org/drawingml/2006/picture">
+                  <pic:nvPicPr>
+                    <pic:cNvPr id="727323402" name=""/>
+                    <pic:cNvPicPr/>
+                  </pic:nvPicPr>
+                  <pic:blipFill>
+                    <a:blip r:embed="rId8"/>
+                    <a:stretch>
+                      <a:fillRect/>
+                    </a:stretch>
+                  </pic:blipFill>
+                  <pic:spPr>
+                    <a:xfrm>
+                      <a:off x="0" y="0"/>
+                      <a:ext cx="5400040" cy="2154555"/>
+                    </a:xfrm>
+                    <a:prstGeom prst="rect">
+                      <a:avLst/>
+                    </a:prstGeom>
+                  </pic:spPr>
+                </pic:pic>
+              </a:graphicData>
+            </a:graphic>
+          </wp:inline>
+        </w:drawing>
+      </w:r>
+    </w:p>
+    <w:p>
+      <w:pPr>
+        <w:pStyle w:val="Descripcin"/>
+        <w:jc w:val="center"/>
+      </w:pPr>
+      <w:r>
+        <w:t xml:space="preserve">Ilustración </w:t>
+      </w:r>
+      <w:fldSimple w:instr=" SEQ Ilustración \* ARABIC ">
+        <w:r>
+          <w:rPr>
+            <w:noProof/>
+          </w:rPr>
+          <w:t>1</w:t>
+        </w:r>
+      </w:fldSimple>
+      <w:r>
+        <w:t xml:space="preserve"> Base de datos</w:t>
+      </w:r>
+    </w:p>
+    <w:p>
+      <w:pPr>
         <w:pStyle w:val="Ttulo1"/>
       </w:pPr>
       <w:bookmarkStart w:id="20" w:name="_Toc224584634"/>
@@ -7027,7 +7087,6 @@
         <w:pStyle w:val="Ttulo1"/>
       </w:pPr>
       <w:bookmarkStart w:id="28" w:name="_Toc224584642"/>
-      <w:proofErr w:type="gramStart"/>
       <w:r>
         <w:t>Conclusiones</w:t>
       </w:r>
@@ -7035,11 +7094,14 @@
         <w:t xml:space="preserve"> finales</w:t>
       </w:r>
       <w:bookmarkEnd w:id="28"/>
-      <w:proofErr w:type="gramEnd"/>
     </w:p>
     <w:sectPr>
-      <w:headerReference w:type="default" r:id="rId8"/>
-      <w:footerReference w:type="default" r:id="rId9"/>
+      <w:headerReference w:type="even" r:id="rId9"/>
+      <w:headerReference w:type="default" r:id="rId10"/>
+      <w:footerReference w:type="even" r:id="rId11"/>
+      <w:footerReference w:type="default" r:id="rId12"/>
+      <w:headerReference w:type="first" r:id="rId13"/>
+      <w:footerReference w:type="first" r:id="rId14"/>
       <w:pgSz w:w="11906" w:h="16838"/>
       <w:pgMar w:top="1417" w:right="1701" w:bottom="1417" w:left="1701" w:header="708" w:footer="708" w:gutter="0"/>
       <w:pgNumType w:start="0"/>
@@ -7077,6 +7139,16 @@
 </file>
 
 <file path=word/footer1.xml><?xml version="1.0" encoding="utf-8"?>
+<w:ftr xmlns:wpc="http://schemas.microsoft.com/office/word/2010/wordprocessingCanvas" xmlns:cx="http://schemas.microsoft.com/office/drawing/2014/chartex" xmlns:cx1="http://schemas.microsoft.com/office/drawing/2015/9/8/chartex" xmlns:cx2="http://schemas.microsoft.com/office/drawing/2015/10/21/chartex" xmlns:cx3="http://schemas.microsoft.com/office/drawing/2016/5/9/chartex" xmlns:cx4="http://schemas.microsoft.com/office/drawing/2016/5/10/chartex" xmlns:cx5="http://schemas.microsoft.com/office/drawing/2016/5/11/chartex" xmlns:cx6="http://schemas.microsoft.com/office/drawing/2016/5/12/chartex" xmlns:cx7="http://schemas.microsoft.com/office/drawing/2016/5/13/chartex" xmlns:cx8="http://schemas.microsoft.com/office/drawing/2016/5/14/chartex" xmlns:mc="http://schemas.openxmlformats.org/markup-compatibility/2006" xmlns:aink="http://schemas.microsoft.com/office/drawing/2016/ink" xmlns:am3d="http://schemas.microsoft.com/office/drawing/2017/model3d" xmlns:o="urn:schemas-microsoft-com:office:office" xmlns:oel="http://schemas.microsoft.com/office/2019/extlst" xmlns:r="http://schemas.openxmlformats.org/officeDocument/2006/relationships" xmlns:m="http://schemas.openxmlformats.org/officeDocument/2006/math" xmlns:v="urn:schemas-microsoft-com:vml" xmlns:wp14="http://schemas.microsoft.com/office/word/2010/wordprocessingDrawing" xmlns:wp="http://schemas.openxmlformats.org/drawingml/2006/wordprocessingDrawing" xmlns:w10="urn:schemas-microsoft-com:office:word" xmlns:w="http://schemas.openxmlformats.org/wordprocessingml/2006/main" xmlns:w14="http://schemas.microsoft.com/office/word/2010/wordml" xmlns:w15="http://schemas.microsoft.com/office/word/2012/wordml" xmlns:w16cex="http://schemas.microsoft.com/office/word/2018/wordml/cex" xmlns:w16cid="http://schemas.microsoft.com/office/word/2016/wordml/cid" xmlns:w16="http://schemas.microsoft.com/office/word/2018/wordml" xmlns:w16du="http://schemas.microsoft.com/office/word/2023/wordml/word16du" xmlns:w16sdtdh="http://schemas.microsoft.com/office/word/2020/wordml/sdtdatahash" xmlns:w16sdtfl="http://schemas.microsoft.com/office/word/2024/wordml/sdtformatlock" xmlns:w16se="http://schemas.microsoft.com/office/word/2015/wordml/symex" xmlns:wpg="http://schemas.microsoft.com/office/word/2010/wordprocessingGroup" xmlns:wpi="http://schemas.microsoft.com/office/word/2010/wordprocessingInk" xmlns:wne="http://schemas.microsoft.com/office/word/2006/wordml" xmlns:wps="http://schemas.microsoft.com/office/word/2010/wordprocessingShape" mc:Ignorable="w14 w15 w16se w16cid w16 w16cex w16sdtdh w16sdtfl w16du wp14">
+  <w:p>
+    <w:pPr>
+      <w:pStyle w:val="Piedepgina"/>
+    </w:pPr>
+  </w:p>
+</w:ftr>
+</file>
+
+<file path=word/footer2.xml><?xml version="1.0" encoding="utf-8"?>
 <w:ftr xmlns:wpc="http://schemas.microsoft.com/office/word/2010/wordprocessingCanvas" xmlns:cx="http://schemas.microsoft.com/office/drawing/2014/chartex" xmlns:cx1="http://schemas.microsoft.com/office/drawing/2015/9/8/chartex" xmlns:cx2="http://schemas.microsoft.com/office/drawing/2015/10/21/chartex" xmlns:cx3="http://schemas.microsoft.com/office/drawing/2016/5/9/chartex" xmlns:cx4="http://schemas.microsoft.com/office/drawing/2016/5/10/chartex" xmlns:cx5="http://schemas.microsoft.com/office/drawing/2016/5/11/chartex" xmlns:cx6="http://schemas.microsoft.com/office/drawing/2016/5/12/chartex" xmlns:cx7="http://schemas.microsoft.com/office/drawing/2016/5/13/chartex" xmlns:cx8="http://schemas.microsoft.com/office/drawing/2016/5/14/chartex" xmlns:mc="http://schemas.openxmlformats.org/markup-compatibility/2006" xmlns:aink="http://schemas.microsoft.com/office/drawing/2016/ink" xmlns:am3d="http://schemas.microsoft.com/office/drawing/2017/model3d" xmlns:o="urn:schemas-microsoft-com:office:office" xmlns:oel="http://schemas.microsoft.com/office/2019/extlst" xmlns:r="http://schemas.openxmlformats.org/officeDocument/2006/relationships" xmlns:m="http://schemas.openxmlformats.org/officeDocument/2006/math" xmlns:v="urn:schemas-microsoft-com:vml" xmlns:wp14="http://schemas.microsoft.com/office/word/2010/wordprocessingDrawing" xmlns:wp="http://schemas.openxmlformats.org/drawingml/2006/wordprocessingDrawing" xmlns:w10="urn:schemas-microsoft-com:office:word" xmlns:w="http://schemas.openxmlformats.org/wordprocessingml/2006/main" xmlns:w14="http://schemas.microsoft.com/office/word/2010/wordml" xmlns:w15="http://schemas.microsoft.com/office/word/2012/wordml" xmlns:w16cex="http://schemas.microsoft.com/office/word/2018/wordml/cex" xmlns:w16cid="http://schemas.microsoft.com/office/word/2016/wordml/cid" xmlns:w16="http://schemas.microsoft.com/office/word/2018/wordml" xmlns:w16du="http://schemas.microsoft.com/office/word/2023/wordml/word16du" xmlns:w16sdtdh="http://schemas.microsoft.com/office/word/2020/wordml/sdtdatahash" xmlns:w16sdtfl="http://schemas.microsoft.com/office/word/2024/wordml/sdtformatlock" xmlns:w16se="http://schemas.microsoft.com/office/word/2015/wordml/symex" xmlns:wpg="http://schemas.microsoft.com/office/word/2010/wordprocessingGroup" xmlns:wpi="http://schemas.microsoft.com/office/word/2010/wordprocessingInk" xmlns:wne="http://schemas.microsoft.com/office/word/2006/wordml" xmlns:wps="http://schemas.microsoft.com/office/word/2010/wordprocessingShape" mc:Ignorable="w14 w15 w16se w16cid w16 w16cex w16sdtdh w16sdtfl w16du wp14">
   <w:sdt>
     <w:sdtPr>
@@ -7118,6 +7190,16 @@
 </w:ftr>
 </file>
 
+<file path=word/footer3.xml><?xml version="1.0" encoding="utf-8"?>
+<w:ftr xmlns:wpc="http://schemas.microsoft.com/office/word/2010/wordprocessingCanvas" xmlns:cx="http://schemas.microsoft.com/office/drawing/2014/chartex" xmlns:cx1="http://schemas.microsoft.com/office/drawing/2015/9/8/chartex" xmlns:cx2="http://schemas.microsoft.com/office/drawing/2015/10/21/chartex" xmlns:cx3="http://schemas.microsoft.com/office/drawing/2016/5/9/chartex" xmlns:cx4="http://schemas.microsoft.com/office/drawing/2016/5/10/chartex" xmlns:cx5="http://schemas.microsoft.com/office/drawing/2016/5/11/chartex" xmlns:cx6="http://schemas.microsoft.com/office/drawing/2016/5/12/chartex" xmlns:cx7="http://schemas.microsoft.com/office/drawing/2016/5/13/chartex" xmlns:cx8="http://schemas.microsoft.com/office/drawing/2016/5/14/chartex" xmlns:mc="http://schemas.openxmlformats.org/markup-compatibility/2006" xmlns:aink="http://schemas.microsoft.com/office/drawing/2016/ink" xmlns:am3d="http://schemas.microsoft.com/office/drawing/2017/model3d" xmlns:o="urn:schemas-microsoft-com:office:office" xmlns:oel="http://schemas.microsoft.com/office/2019/extlst" xmlns:r="http://schemas.openxmlformats.org/officeDocument/2006/relationships" xmlns:m="http://schemas.openxmlformats.org/officeDocument/2006/math" xmlns:v="urn:schemas-microsoft-com:vml" xmlns:wp14="http://schemas.microsoft.com/office/word/2010/wordprocessingDrawing" xmlns:wp="http://schemas.openxmlformats.org/drawingml/2006/wordprocessingDrawing" xmlns:w10="urn:schemas-microsoft-com:office:word" xmlns:w="http://schemas.openxmlformats.org/wordprocessingml/2006/main" xmlns:w14="http://schemas.microsoft.com/office/word/2010/wordml" xmlns:w15="http://schemas.microsoft.com/office/word/2012/wordml" xmlns:w16cex="http://schemas.microsoft.com/office/word/2018/wordml/cex" xmlns:w16cid="http://schemas.microsoft.com/office/word/2016/wordml/cid" xmlns:w16="http://schemas.microsoft.com/office/word/2018/wordml" xmlns:w16du="http://schemas.microsoft.com/office/word/2023/wordml/word16du" xmlns:w16sdtdh="http://schemas.microsoft.com/office/word/2020/wordml/sdtdatahash" xmlns:w16sdtfl="http://schemas.microsoft.com/office/word/2024/wordml/sdtformatlock" xmlns:w16se="http://schemas.microsoft.com/office/word/2015/wordml/symex" xmlns:wpg="http://schemas.microsoft.com/office/word/2010/wordprocessingGroup" xmlns:wpi="http://schemas.microsoft.com/office/word/2010/wordprocessingInk" xmlns:wne="http://schemas.microsoft.com/office/word/2006/wordml" xmlns:wps="http://schemas.microsoft.com/office/word/2010/wordprocessingShape" mc:Ignorable="w14 w15 w16se w16cid w16 w16cex w16sdtdh w16sdtfl w16du wp14">
+  <w:p>
+    <w:pPr>
+      <w:pStyle w:val="Piedepgina"/>
+    </w:pPr>
+  </w:p>
+</w:ftr>
+</file>
+
 <file path=word/footnotes.xml><?xml version="1.0" encoding="utf-8"?>
 <w:footnotes xmlns:wpc="http://schemas.microsoft.com/office/word/2010/wordprocessingCanvas" xmlns:cx="http://schemas.microsoft.com/office/drawing/2014/chartex" xmlns:cx1="http://schemas.microsoft.com/office/drawing/2015/9/8/chartex" xmlns:cx2="http://schemas.microsoft.com/office/drawing/2015/10/21/chartex" xmlns:cx3="http://schemas.microsoft.com/office/drawing/2016/5/9/chartex" xmlns:cx4="http://schemas.microsoft.com/office/drawing/2016/5/10/chartex" xmlns:cx5="http://schemas.microsoft.com/office/drawing/2016/5/11/chartex" xmlns:cx6="http://schemas.microsoft.com/office/drawing/2016/5/12/chartex" xmlns:cx7="http://schemas.microsoft.com/office/drawing/2016/5/13/chartex" xmlns:cx8="http://schemas.microsoft.com/office/drawing/2016/5/14/chartex" xmlns:mc="http://schemas.openxmlformats.org/markup-compatibility/2006" xmlns:aink="http://schemas.microsoft.com/office/drawing/2016/ink" xmlns:am3d="http://schemas.microsoft.com/office/drawing/2017/model3d" xmlns:o="urn:schemas-microsoft-com:office:office" xmlns:oel="http://schemas.microsoft.com/office/2019/extlst" xmlns:r="http://schemas.openxmlformats.org/officeDocument/2006/relationships" xmlns:m="http://schemas.openxmlformats.org/officeDocument/2006/math" xmlns:v="urn:schemas-microsoft-com:vml" xmlns:wp14="http://schemas.microsoft.com/office/word/2010/wordprocessingDrawing" xmlns:wp="http://schemas.openxmlformats.org/drawingml/2006/wordprocessingDrawing" xmlns:w10="urn:schemas-microsoft-com:office:word" xmlns:w="http://schemas.openxmlformats.org/wordprocessingml/2006/main" xmlns:w14="http://schemas.microsoft.com/office/word/2010/wordml" xmlns:w15="http://schemas.microsoft.com/office/word/2012/wordml" xmlns:w16cex="http://schemas.microsoft.com/office/word/2018/wordml/cex" xmlns:w16cid="http://schemas.microsoft.com/office/word/2016/wordml/cid" xmlns:w16="http://schemas.microsoft.com/office/word/2018/wordml" xmlns:w16du="http://schemas.microsoft.com/office/word/2023/wordml/word16du" xmlns:w16sdtdh="http://schemas.microsoft.com/office/word/2020/wordml/sdtdatahash" xmlns:w16sdtfl="http://schemas.microsoft.com/office/word/2024/wordml/sdtformatlock" xmlns:w16se="http://schemas.microsoft.com/office/word/2015/wordml/symex" xmlns:wpg="http://schemas.microsoft.com/office/word/2010/wordprocessingGroup" xmlns:wpi="http://schemas.microsoft.com/office/word/2010/wordprocessingInk" xmlns:wne="http://schemas.microsoft.com/office/word/2006/wordml" xmlns:wps="http://schemas.microsoft.com/office/word/2010/wordprocessingShape" mc:Ignorable="w14 w15 w16se w16cid w16 w16cex w16sdtdh w16sdtfl w16du wp14">
   <w:footnote w:type="separator" w:id="-1">
@@ -7144,6 +7226,16 @@
 </file>
 
 <file path=word/header1.xml><?xml version="1.0" encoding="utf-8"?>
+<w:hdr xmlns:wpc="http://schemas.microsoft.com/office/word/2010/wordprocessingCanvas" xmlns:cx="http://schemas.microsoft.com/office/drawing/2014/chartex" xmlns:cx1="http://schemas.microsoft.com/office/drawing/2015/9/8/chartex" xmlns:cx2="http://schemas.microsoft.com/office/drawing/2015/10/21/chartex" xmlns:cx3="http://schemas.microsoft.com/office/drawing/2016/5/9/chartex" xmlns:cx4="http://schemas.microsoft.com/office/drawing/2016/5/10/chartex" xmlns:cx5="http://schemas.microsoft.com/office/drawing/2016/5/11/chartex" xmlns:cx6="http://schemas.microsoft.com/office/drawing/2016/5/12/chartex" xmlns:cx7="http://schemas.microsoft.com/office/drawing/2016/5/13/chartex" xmlns:cx8="http://schemas.microsoft.com/office/drawing/2016/5/14/chartex" xmlns:mc="http://schemas.openxmlformats.org/markup-compatibility/2006" xmlns:aink="http://schemas.microsoft.com/office/drawing/2016/ink" xmlns:am3d="http://schemas.microsoft.com/office/drawing/2017/model3d" xmlns:o="urn:schemas-microsoft-com:office:office" xmlns:oel="http://schemas.microsoft.com/office/2019/extlst" xmlns:r="http://schemas.openxmlformats.org/officeDocument/2006/relationships" xmlns:m="http://schemas.openxmlformats.org/officeDocument/2006/math" xmlns:v="urn:schemas-microsoft-com:vml" xmlns:wp14="http://schemas.microsoft.com/office/word/2010/wordprocessingDrawing" xmlns:wp="http://schemas.openxmlformats.org/drawingml/2006/wordprocessingDrawing" xmlns:w10="urn:schemas-microsoft-com:office:word" xmlns:w="http://schemas.openxmlformats.org/wordprocessingml/2006/main" xmlns:w14="http://schemas.microsoft.com/office/word/2010/wordml" xmlns:w15="http://schemas.microsoft.com/office/word/2012/wordml" xmlns:w16cex="http://schemas.microsoft.com/office/word/2018/wordml/cex" xmlns:w16cid="http://schemas.microsoft.com/office/word/2016/wordml/cid" xmlns:w16="http://schemas.microsoft.com/office/word/2018/wordml" xmlns:w16du="http://schemas.microsoft.com/office/word/2023/wordml/word16du" xmlns:w16sdtdh="http://schemas.microsoft.com/office/word/2020/wordml/sdtdatahash" xmlns:w16sdtfl="http://schemas.microsoft.com/office/word/2024/wordml/sdtformatlock" xmlns:w16se="http://schemas.microsoft.com/office/word/2015/wordml/symex" xmlns:wpg="http://schemas.microsoft.com/office/word/2010/wordprocessingGroup" xmlns:wpi="http://schemas.microsoft.com/office/word/2010/wordprocessingInk" xmlns:wne="http://schemas.microsoft.com/office/word/2006/wordml" xmlns:wps="http://schemas.microsoft.com/office/word/2010/wordprocessingShape" mc:Ignorable="w14 w15 w16se w16cid w16 w16cex w16sdtdh w16sdtfl w16du wp14">
+  <w:p>
+    <w:pPr>
+      <w:pStyle w:val="Encabezado"/>
+    </w:pPr>
+  </w:p>
+</w:hdr>
+</file>
+
+<file path=word/header2.xml><?xml version="1.0" encoding="utf-8"?>
 <w:hdr xmlns:wpc="http://schemas.microsoft.com/office/word/2010/wordprocessingCanvas" xmlns:cx="http://schemas.microsoft.com/office/drawing/2014/chartex" xmlns:cx1="http://schemas.microsoft.com/office/drawing/2015/9/8/chartex" xmlns:cx2="http://schemas.microsoft.com/office/drawing/2015/10/21/chartex" xmlns:cx3="http://schemas.microsoft.com/office/drawing/2016/5/9/chartex" xmlns:cx4="http://schemas.microsoft.com/office/drawing/2016/5/10/chartex" xmlns:cx5="http://schemas.microsoft.com/office/drawing/2016/5/11/chartex" xmlns:cx6="http://schemas.microsoft.com/office/drawing/2016/5/12/chartex" xmlns:cx7="http://schemas.microsoft.com/office/drawing/2016/5/13/chartex" xmlns:cx8="http://schemas.microsoft.com/office/drawing/2016/5/14/chartex" xmlns:mc="http://schemas.openxmlformats.org/markup-compatibility/2006" xmlns:aink="http://schemas.microsoft.com/office/drawing/2016/ink" xmlns:am3d="http://schemas.microsoft.com/office/drawing/2017/model3d" xmlns:o="urn:schemas-microsoft-com:office:office" xmlns:oel="http://schemas.microsoft.com/office/2019/extlst" xmlns:r="http://schemas.openxmlformats.org/officeDocument/2006/relationships" xmlns:m="http://schemas.openxmlformats.org/officeDocument/2006/math" xmlns:v="urn:schemas-microsoft-com:vml" xmlns:wp14="http://schemas.microsoft.com/office/word/2010/wordprocessingDrawing" xmlns:wp="http://schemas.openxmlformats.org/drawingml/2006/wordprocessingDrawing" xmlns:w10="urn:schemas-microsoft-com:office:word" xmlns:w="http://schemas.openxmlformats.org/wordprocessingml/2006/main" xmlns:w14="http://schemas.microsoft.com/office/word/2010/wordml" xmlns:w15="http://schemas.microsoft.com/office/word/2012/wordml" xmlns:w16cex="http://schemas.microsoft.com/office/word/2018/wordml/cex" xmlns:w16cid="http://schemas.microsoft.com/office/word/2016/wordml/cid" xmlns:w16="http://schemas.microsoft.com/office/word/2018/wordml" xmlns:w16du="http://schemas.microsoft.com/office/word/2023/wordml/word16du" xmlns:w16sdtdh="http://schemas.microsoft.com/office/word/2020/wordml/sdtdatahash" xmlns:w16sdtfl="http://schemas.microsoft.com/office/word/2024/wordml/sdtformatlock" xmlns:w16se="http://schemas.microsoft.com/office/word/2015/wordml/symex" xmlns:wpg="http://schemas.microsoft.com/office/word/2010/wordprocessingGroup" xmlns:wpi="http://schemas.microsoft.com/office/word/2010/wordprocessingInk" xmlns:wne="http://schemas.microsoft.com/office/word/2006/wordml" xmlns:wps="http://schemas.microsoft.com/office/word/2010/wordprocessingShape" mc:Ignorable="w14 w15 w16se w16cid w16 w16cex w16sdtdh w16sdtfl w16du wp14">
   <w:p>
     <w:pPr>
@@ -7157,7 +7249,7 @@
       <mc:AlternateContent>
         <mc:Choice Requires="wps">
           <w:drawing>
-            <wp:anchor distT="0" distB="0" distL="114300" distR="114300" simplePos="0" relativeHeight="251661312" behindDoc="0" locked="0" layoutInCell="1" allowOverlap="1" wp14:anchorId="2B2B51A6" wp14:editId="37E81C3E">
+            <wp:anchor distT="0" distB="0" distL="114300" distR="114300" simplePos="0" relativeHeight="251659264" behindDoc="0" locked="0" layoutInCell="1" allowOverlap="1" wp14:anchorId="1861E7E9" wp14:editId="7F0AA776">
               <wp:simplePos x="0" y="0"/>
               <wp:positionH relativeFrom="page">
                 <wp:align>center</wp:align>
@@ -7227,7 +7319,7 @@
         </mc:Choice>
         <mc:Fallback>
           <w:pict>
-            <v:rect w14:anchorId="2847969B" id="Rectángulo 233" o:spid="_x0000_s1026" style="position:absolute;margin-left:0;margin-top:0;width:580.8pt;height:752.4pt;z-index:251661312;visibility:visible;mso-wrap-style:square;mso-width-percent:950;mso-height-percent:950;mso-wrap-distance-left:9pt;mso-wrap-distance-top:0;mso-wrap-distance-right:9pt;mso-wrap-distance-bottom:0;mso-position-horizontal:center;mso-position-horizontal-relative:page;mso-position-vertical:center;mso-position-vertical-relative:page;mso-width-percent:950;mso-height-percent:950;mso-width-relative:page;mso-height-relative:page;v-text-anchor:middle" o:gfxdata="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" filled="f" strokecolor="#737373 [1614]" strokeweight="1.25pt">
+            <v:rect w14:anchorId="75C473BF" id="Rectángulo 233" o:spid="_x0000_s1026" style="position:absolute;margin-left:0;margin-top:0;width:580.8pt;height:752.4pt;z-index:251659264;visibility:visible;mso-wrap-style:square;mso-width-percent:950;mso-height-percent:950;mso-wrap-distance-left:9pt;mso-wrap-distance-top:0;mso-wrap-distance-right:9pt;mso-wrap-distance-bottom:0;mso-position-horizontal:center;mso-position-horizontal-relative:page;mso-position-vertical:center;mso-position-vertical-relative:page;mso-width-percent:950;mso-height-percent:950;mso-width-relative:page;mso-height-relative:page;v-text-anchor:middle" o:gfxdata="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" filled="f" strokecolor="#737373 [1614]" strokeweight="1.25pt">
               <w10:wrap anchorx="page" anchory="page"/>
             </v:rect>
           </w:pict>
@@ -7244,7 +7336,7 @@
         <w:alias w:val="Título"/>
         <w:id w:val="15524250"/>
         <w:placeholder>
-          <w:docPart w:val="8B582EC085124C3BB2A39FA900DD0D5F"/>
+          <w:docPart w:val="8963FFFACB254359ADFAE670CCF79C56"/>
         </w:placeholder>
         <w:dataBinding w:prefixMappings="xmlns:ns0='http://schemas.openxmlformats.org/package/2006/metadata/core-properties' xmlns:ns1='http://purl.org/dc/elements/1.1/'" w:xpath="/ns0:coreProperties[1]/ns1:title[1]" w:storeItemID="{6C3C8BC8-F283-45AE-878A-BAB7291924A1}"/>
         <w:text/>
@@ -7260,7 +7352,98 @@
         </w:r>
       </w:sdtContent>
     </w:sdt>
+    <w:r>
+      <w:rPr>
+        <w:color w:val="156082" w:themeColor="accent1"/>
+        <w:sz w:val="20"/>
+        <w:szCs w:val="20"/>
+      </w:rPr>
+      <w:tab/>
+    </w:r>
+    <w:r>
+      <w:rPr>
+        <w:color w:val="156082" w:themeColor="accent1"/>
+        <w:sz w:val="20"/>
+        <w:szCs w:val="20"/>
+      </w:rPr>
+      <w:tab/>
+    </w:r>
+    <w:r>
+      <w:rPr>
+        <w:color w:val="156082" w:themeColor="accent1"/>
+        <w:sz w:val="20"/>
+        <w:szCs w:val="20"/>
+      </w:rPr>
+      <w:tab/>
+    </w:r>
+    <w:r>
+      <w:rPr>
+        <w:color w:val="156082" w:themeColor="accent1"/>
+        <w:sz w:val="20"/>
+        <w:szCs w:val="20"/>
+      </w:rPr>
+      <w:tab/>
+    </w:r>
+    <w:r>
+      <w:rPr>
+        <w:color w:val="156082" w:themeColor="accent1"/>
+        <w:sz w:val="20"/>
+        <w:szCs w:val="20"/>
+      </w:rPr>
+      <w:tab/>
+    </w:r>
+    <w:r>
+      <w:rPr>
+        <w:color w:val="156082" w:themeColor="accent1"/>
+        <w:sz w:val="20"/>
+        <w:szCs w:val="20"/>
+      </w:rPr>
+      <w:tab/>
+    </w:r>
+    <w:r>
+      <w:rPr>
+        <w:color w:val="156082" w:themeColor="accent1"/>
+        <w:sz w:val="20"/>
+        <w:szCs w:val="20"/>
+      </w:rPr>
+      <w:tab/>
+    </w:r>
+    <w:r>
+      <w:rPr>
+        <w:color w:val="156082" w:themeColor="accent1"/>
+        <w:sz w:val="20"/>
+        <w:szCs w:val="20"/>
+      </w:rPr>
+      <w:tab/>
+    </w:r>
+    <w:r>
+      <w:rPr>
+        <w:color w:val="156082" w:themeColor="accent1"/>
+        <w:sz w:val="20"/>
+        <w:szCs w:val="20"/>
+      </w:rPr>
+      <w:tab/>
+    </w:r>
+    <w:r>
+      <w:rPr>
+        <w:color w:val="156082" w:themeColor="accent1"/>
+        <w:sz w:val="20"/>
+        <w:szCs w:val="20"/>
+      </w:rPr>
+      <w:tab/>
+      <w:t>Victor Garzon</w:t>
+    </w:r>
   </w:p>
+  <w:p>
+    <w:pPr>
+      <w:pStyle w:val="Encabezado"/>
+    </w:pPr>
+  </w:p>
+</w:hdr>
+</file>
+
+<file path=word/header3.xml><?xml version="1.0" encoding="utf-8"?>
+<w:hdr xmlns:wpc="http://schemas.microsoft.com/office/word/2010/wordprocessingCanvas" xmlns:cx="http://schemas.microsoft.com/office/drawing/2014/chartex" xmlns:cx1="http://schemas.microsoft.com/office/drawing/2015/9/8/chartex" xmlns:cx2="http://schemas.microsoft.com/office/drawing/2015/10/21/chartex" xmlns:cx3="http://schemas.microsoft.com/office/drawing/2016/5/9/chartex" xmlns:cx4="http://schemas.microsoft.com/office/drawing/2016/5/10/chartex" xmlns:cx5="http://schemas.microsoft.com/office/drawing/2016/5/11/chartex" xmlns:cx6="http://schemas.microsoft.com/office/drawing/2016/5/12/chartex" xmlns:cx7="http://schemas.microsoft.com/office/drawing/2016/5/13/chartex" xmlns:cx8="http://schemas.microsoft.com/office/drawing/2016/5/14/chartex" xmlns:mc="http://schemas.openxmlformats.org/markup-compatibility/2006" xmlns:aink="http://schemas.microsoft.com/office/drawing/2016/ink" xmlns:am3d="http://schemas.microsoft.com/office/drawing/2017/model3d" xmlns:o="urn:schemas-microsoft-com:office:office" xmlns:oel="http://schemas.microsoft.com/office/2019/extlst" xmlns:r="http://schemas.openxmlformats.org/officeDocument/2006/relationships" xmlns:m="http://schemas.openxmlformats.org/officeDocument/2006/math" xmlns:v="urn:schemas-microsoft-com:vml" xmlns:wp14="http://schemas.microsoft.com/office/word/2010/wordprocessingDrawing" xmlns:wp="http://schemas.openxmlformats.org/drawingml/2006/wordprocessingDrawing" xmlns:w10="urn:schemas-microsoft-com:office:word" xmlns:w="http://schemas.openxmlformats.org/wordprocessingml/2006/main" xmlns:w14="http://schemas.microsoft.com/office/word/2010/wordml" xmlns:w15="http://schemas.microsoft.com/office/word/2012/wordml" xmlns:w16cex="http://schemas.microsoft.com/office/word/2018/wordml/cex" xmlns:w16cid="http://schemas.microsoft.com/office/word/2016/wordml/cid" xmlns:w16="http://schemas.microsoft.com/office/word/2018/wordml" xmlns:w16du="http://schemas.microsoft.com/office/word/2023/wordml/word16du" xmlns:w16sdtdh="http://schemas.microsoft.com/office/word/2020/wordml/sdtdatahash" xmlns:w16sdtfl="http://schemas.microsoft.com/office/word/2024/wordml/sdtformatlock" xmlns:w16se="http://schemas.microsoft.com/office/word/2015/wordml/symex" xmlns:wpg="http://schemas.microsoft.com/office/word/2010/wordprocessingGroup" xmlns:wpi="http://schemas.microsoft.com/office/word/2010/wordprocessingInk" xmlns:wne="http://schemas.microsoft.com/office/word/2006/wordml" xmlns:wps="http://schemas.microsoft.com/office/word/2010/wordprocessingShape" mc:Ignorable="w14 w15 w16se w16cid w16 w16cex w16sdtdh w16sdtfl w16du wp14">
   <w:p>
     <w:pPr>
       <w:pStyle w:val="Encabezado"/>
@@ -9378,6 +9561,7 @@
   <w:style w:type="character" w:default="1" w:styleId="Fuentedeprrafopredeter">
     <w:name w:val="Default Paragraph Font"/>
     <w:uiPriority w:val="1"/>
+    <w:semiHidden/>
     <w:unhideWhenUsed/>
   </w:style>
   <w:style w:type="table" w:default="1" w:styleId="Tablanormal">
@@ -9793,7 +9977,6 @@
     <w:basedOn w:val="Normal"/>
     <w:next w:val="Normal"/>
     <w:uiPriority w:val="35"/>
-    <w:semiHidden/>
     <w:unhideWhenUsed/>
     <w:qFormat/>
     <w:rsid w:val="009B4AA7"/>
@@ -9924,7 +10107,7 @@
   <w:docParts>
     <w:docPart>
       <w:docPartPr>
-        <w:name w:val="8B582EC085124C3BB2A39FA900DD0D5F"/>
+        <w:name w:val="8963FFFACB254359ADFAE670CCF79C56"/>
         <w:category>
           <w:name w:val="General"/>
           <w:gallery w:val="placeholder"/>
@@ -9935,12 +10118,12 @@
         <w:behaviors>
           <w:behavior w:val="content"/>
         </w:behaviors>
-        <w:guid w:val="{815CC23D-982D-49FD-AC36-409D18A610C3}"/>
+        <w:guid w:val="{A4C508AA-D04A-4317-9CCB-3E37037480EF}"/>
       </w:docPartPr>
       <w:docPartBody>
         <w:p>
           <w:pPr>
-            <w:pStyle w:val="8B582EC085124C3BB2A39FA900DD0D5F"/>
+            <w:pStyle w:val="8963FFFACB254359ADFAE670CCF79C56"/>
           </w:pPr>
           <w:r>
             <w:rPr>
@@ -9959,19 +10142,19 @@
 
 <file path=word/glossary/fontTable.xml><?xml version="1.0" encoding="utf-8"?>
 <w:fonts xmlns:mc="http://schemas.openxmlformats.org/markup-compatibility/2006" xmlns:r="http://schemas.openxmlformats.org/officeDocument/2006/relationships" xmlns:w="http://schemas.openxmlformats.org/wordprocessingml/2006/main" xmlns:w14="http://schemas.microsoft.com/office/word/2010/wordml" xmlns:w15="http://schemas.microsoft.com/office/word/2012/wordml" xmlns:w16cex="http://schemas.microsoft.com/office/word/2018/wordml/cex" xmlns:w16cid="http://schemas.microsoft.com/office/word/2016/wordml/cid" xmlns:w16="http://schemas.microsoft.com/office/word/2018/wordml" xmlns:w16du="http://schemas.microsoft.com/office/word/2023/wordml/word16du" xmlns:w16sdtdh="http://schemas.microsoft.com/office/word/2020/wordml/sdtdatahash" xmlns:w16sdtfl="http://schemas.microsoft.com/office/word/2024/wordml/sdtformatlock" xmlns:w16se="http://schemas.microsoft.com/office/word/2015/wordml/symex" mc:Ignorable="w14 w15 w16se w16cid w16 w16cex w16sdtdh w16sdtfl w16du">
+  <w:font w:name="Symbol">
+    <w:panose1 w:val="05050102010706020507"/>
+    <w:charset w:val="02"/>
+    <w:family w:val="roman"/>
+    <w:pitch w:val="variable"/>
+    <w:sig w:usb0="00000000" w:usb1="10000000" w:usb2="00000000" w:usb3="00000000" w:csb0="80000000" w:csb1="00000000"/>
+  </w:font>
   <w:font w:name="Times New Roman">
     <w:panose1 w:val="02020603050405020304"/>
     <w:charset w:val="00"/>
     <w:family w:val="roman"/>
     <w:pitch w:val="variable"/>
     <w:sig w:usb0="E0002EFF" w:usb1="C000785B" w:usb2="00000009" w:usb3="00000000" w:csb0="000001FF" w:csb1="00000000"/>
-  </w:font>
-  <w:font w:name="Symbol">
-    <w:panose1 w:val="05050102010706020507"/>
-    <w:charset w:val="02"/>
-    <w:family w:val="roman"/>
-    <w:pitch w:val="variable"/>
-    <w:sig w:usb0="00000000" w:usb1="10000000" w:usb2="00000000" w:usb3="00000000" w:csb0="80000000" w:csb1="00000000"/>
   </w:font>
   <w:font w:name="Courier New">
     <w:panose1 w:val="02070309020205020404"/>
@@ -10019,9 +10202,15 @@
   </w:compat>
   <w:rsids>
     <w:rsidRoot w:val="007A0C3A"/>
+    <w:rsid w:val="00252C4B"/>
+    <w:rsid w:val="00440493"/>
+    <w:rsid w:val="005B7258"/>
     <w:rsid w:val="006518E9"/>
     <w:rsid w:val="007A0C3A"/>
+    <w:rsid w:val="00AF7715"/>
     <w:rsid w:val="00B01CA0"/>
+    <w:rsid w:val="00E9598C"/>
+    <w:rsid w:val="00EC5806"/>
   </w:rsids>
   <m:mathPr>
     <m:mathFont m:val="Cambria Math"/>
@@ -10476,6 +10665,14 @@
     <w:name w:val="8B582EC085124C3BB2A39FA900DD0D5F"/>
     <w:rsid w:val="007A0C3A"/>
   </w:style>
+  <w:style w:type="paragraph" w:customStyle="1" w:styleId="500E66B6C89346EB9F29064E2C5E5BC2">
+    <w:name w:val="500E66B6C89346EB9F29064E2C5E5BC2"/>
+    <w:rsid w:val="00440493"/>
+  </w:style>
+  <w:style w:type="paragraph" w:customStyle="1" w:styleId="8963FFFACB254359ADFAE670CCF79C56">
+    <w:name w:val="8963FFFACB254359ADFAE670CCF79C56"/>
+    <w:rsid w:val="00440493"/>
+  </w:style>
 </w:styles>
 </file>
 

</xml_diff>